<commit_message>
chore: update On-Licence Housing Allocation System documentation
</commit_message>
<xml_diff>
--- a/On-Licence_Housing_Allocation_System_Documentation.docx
+++ b/On-Licence_Housing_Allocation_System_Documentation.docx
@@ -4871,6 +4871,127 @@
     <w:p>
       <w:r>
         <w:br w:type="page"/>
+      </w:r>
+    </w:p>
+    <w:p>
+      <w:pPr>
+        <w:pStyle w:val="Heading1"/>
+        <w:spacing w:after="160" w:before="360"/>
+      </w:pPr>
+      <w:r>
+        <w:t xml:space="preserve">5.1 Student-Suggested Matching Criteria (Added Beyond the Brief)</w:t>
+      </w:r>
+    </w:p>
+    <w:p>
+      <w:pPr>
+        <w:spacing w:after="140"/>
+      </w:pPr>
+      <w:r>
+        <w:t xml:space="preserve">The brief's Table 1 lists a fixed set of matching factors plus three 'Future Expansion' placeholders, and separately requires the submission to propose two additional, original matching criteria of its own ('Student Suggested 1' and 'Student Suggested 2'), warning that leaving these blank, or duplicating another student's suggestions, costs marks. This project adds two such criteria, both implemented exactly like every other Table 1 row — as an entry in MATCHING_RULES (logic/matching.py) with a matching licensee-side and RHU-side attribute, editable through the same shared AttributeEditor used for every other criterion, and documented in README.md.</w:t>
+      </w:r>
+    </w:p>
+    <w:p>
+      <w:pPr>
+        <w:pStyle w:val="Heading2"/>
+        <w:spacing w:after="120" w:before="260"/>
+      </w:pPr>
+      <w:r>
+        <w:t xml:space="preserve">Student Suggested 1 — Digital / Electronic Monitoring Suitability</w:t>
+      </w:r>
+    </w:p>
+    <w:p>
+      <w:pPr>
+        <w:pStyle w:val="ListParagraph"/>
+        <w:numPr>
+          <w:ilvl w:val="0"/>
+          <w:numId w:val="1"/>
+        </w:numPr>
+        <w:spacing w:after="60"/>
+      </w:pPr>
+      <w:r>
+        <w:t xml:space="preserve">Rule: logic/matching.py, line 53–54 — ("digital_monitoring_required", "digital_monitoring_support", YesNoAttribute(...)).</w:t>
+      </w:r>
+    </w:p>
+    <w:p>
+      <w:pPr>
+        <w:pStyle w:val="ListParagraph"/>
+        <w:numPr>
+          <w:ilvl w:val="0"/>
+          <w:numId w:val="1"/>
+        </w:numPr>
+        <w:spacing w:after="60"/>
+      </w:pPr>
+      <w:r>
+        <w:t xml:space="preserve">Rationale: some licensees are subject to electronic tagging or other digital monitoring conditions as part of their licence; not every RHU has the connectivity, staffing, or policy to support a resident on digital monitoring. This is recorded as a simple yes/no requirement on the licensee (digital_monitoring_required) matched against a yes/no capability on the RHU (digital_monitoring_support).</w:t>
+      </w:r>
+    </w:p>
+    <w:p>
+      <w:pPr>
+        <w:pStyle w:val="ListParagraph"/>
+        <w:numPr>
+          <w:ilvl w:val="0"/>
+          <w:numId w:val="1"/>
+        </w:numPr>
+        <w:spacing w:after="60"/>
+      </w:pPr>
+      <w:r>
+        <w:t xml:space="preserve">Editor: appears automatically in both LicenseeEditor and RHUEditor as a checkbox labelled “Digital monitoring support (Student Suggested 1)”, generated by AttributeEditor from the same MATCHING_RULES row.</w:t>
+      </w:r>
+    </w:p>
+    <w:p>
+      <w:pPr>
+        <w:pStyle w:val="Heading2"/>
+        <w:spacing w:after="120" w:before="260"/>
+      </w:pPr>
+      <w:r>
+        <w:t xml:space="preserve">Student Suggested 2 — Peer Environment Compatibility</w:t>
+      </w:r>
+    </w:p>
+    <w:p>
+      <w:pPr>
+        <w:pStyle w:val="ListParagraph"/>
+        <w:numPr>
+          <w:ilvl w:val="0"/>
+          <w:numId w:val="1"/>
+        </w:numPr>
+        <w:spacing w:after="60"/>
+      </w:pPr>
+      <w:r>
+        <w:t xml:space="preserve">Rule: logic/matching.py, line 56–60 — ("peer_environment_need", "peer_environment", TextAttribute(...)).</w:t>
+      </w:r>
+    </w:p>
+    <w:p>
+      <w:pPr>
+        <w:pStyle w:val="ListParagraph"/>
+        <w:numPr>
+          <w:ilvl w:val="0"/>
+          <w:numId w:val="1"/>
+        </w:numPr>
+        <w:spacing w:after="60"/>
+      </w:pPr>
+      <w:r>
+        <w:t xml:space="preserve">Rationale (from README.md): peer-environment compatibility, covering risks such as intimidation, gang association, and exploitation by other residents. A licensee's need is recorded as one of Low conflict / Structured / High support, and matched against the equivalent label describing the RHU's peer environment, so the AO can avoid placing a vulnerable licensee into a house whose existing resident mix would put them at risk.</w:t>
+      </w:r>
+    </w:p>
+    <w:p>
+      <w:pPr>
+        <w:pStyle w:val="ListParagraph"/>
+        <w:numPr>
+          <w:ilvl w:val="0"/>
+          <w:numId w:val="1"/>
+        </w:numPr>
+        <w:spacing w:after="60"/>
+      </w:pPr>
+      <w:r>
+        <w:t xml:space="preserve">Editor: appears automatically in both LicenseeEditor and RHUEditor as a labelled text field “Peer environment (Student Suggested 2)”, generated the same way as Student Suggested 1.</w:t>
+      </w:r>
+    </w:p>
+    <w:p>
+      <w:pPr>
+        <w:spacing w:after="140"/>
+      </w:pPr>
+      <w:r>
+        <w:t xml:space="preserve">Because both criteria are declared as ordinary MATCHING_RULES rows rather than special-cased code, they are ranked, scored, and shown as warnings in the Allocation tab exactly like every brief-specified factor — nothing about the ranking engine, the editors, or the ranked table needed to know these two rules were student-added.</w:t>
       </w:r>
     </w:p>
     <w:p>

</xml_diff>